<commit_message>
update: 更新 index.html + 履歷檔案
</commit_message>
<xml_diff>
--- a/Reyna_Gao_Resume_EN.docx
+++ b/Reyna_Gao_Resume_EN.docx
@@ -1133,61 +1133,162 @@
       <w:r>
         <w:rPr>
           <w:rFonts w:ascii="Arial" w:cs="Arial" w:eastAsia="Arial" w:hAnsi="Arial"/>
-          <w:b w:val="false"/>
-          <w:bCs w:val="false"/>
-          <w:i w:val="false"/>
-          <w:iCs w:val="false"/>
-          <w:color w:val="595959"/>
-          <w:sz w:val="20"/>
-          <w:szCs w:val="20"/>
-        </w:rPr>
-        <w:t xml:space="preserve">Built an e-commerce website for an international spirits brand on Shopline with custom HTML/CSS architecture, marketing funnel integration, and SEO optimization.</w:t>
-      </w:r>
-    </w:p>
-    <w:p>
-      <w:pPr>
-        <w:pStyle w:val="ListParagraph"/>
-        <w:numPr>
-          <w:ilvl w:val="0"/>
-          <w:numId w:val="2"/>
-        </w:numPr>
-        <w:spacing w:after="60" w:before="0"/>
-      </w:pPr>
-      <w:r>
-        <w:rPr>
-          <w:rFonts w:ascii="Arial" w:cs="Arial" w:eastAsia="Arial" w:hAnsi="Arial"/>
-          <w:b w:val="false"/>
-          <w:bCs w:val="false"/>
-          <w:i w:val="false"/>
-          <w:iCs w:val="false"/>
-          <w:color w:val="595959"/>
-          <w:sz w:val="20"/>
-          <w:szCs w:val="20"/>
-        </w:rPr>
-        <w:t xml:space="preserve">Solo-completed full UI/UX design for a Korean floral brand e-commerce site, from market analysis through Figma high-fidelity prototyping.</w:t>
-      </w:r>
-    </w:p>
-    <w:p>
-      <w:pPr>
-        <w:pStyle w:val="ListParagraph"/>
-        <w:numPr>
-          <w:ilvl w:val="0"/>
-          <w:numId w:val="2"/>
-        </w:numPr>
-        <w:spacing w:after="60" w:before="0"/>
-      </w:pPr>
-      <w:r>
-        <w:rPr>
-          <w:rFonts w:ascii="Arial" w:cs="Arial" w:eastAsia="Arial" w:hAnsi="Arial"/>
-          <w:b/>
-          <w:bCs/>
-          <w:i w:val="false"/>
-          <w:iCs w:val="false"/>
-          <w:color w:val="1d1d1f"/>
-          <w:sz w:val="20"/>
-          <w:szCs w:val="20"/>
-        </w:rPr>
-        <w:t xml:space="preserve">Earned Adobe Photoshop &amp; Illustrator professional dual certification.</w:t>
+          <w:b/>
+          <w:bCs/>
+          <w:i w:val="false"/>
+          <w:iCs w:val="false"/>
+          <w:color w:val="1d1d1f"/>
+          <w:sz w:val="20"/>
+          <w:szCs w:val="20"/>
+        </w:rPr>
+        <w:t xml:space="preserve">[E-commerce Frontend Build]  </w:t>
+      </w:r>
+      <w:r>
+        <w:rPr>
+          <w:rFonts w:ascii="Arial" w:cs="Arial" w:eastAsia="Arial" w:hAnsi="Arial"/>
+          <w:b w:val="false"/>
+          <w:bCs w:val="false"/>
+          <w:i w:val="false"/>
+          <w:iCs w:val="false"/>
+          <w:color w:val="595959"/>
+          <w:sz w:val="20"/>
+          <w:szCs w:val="20"/>
+        </w:rPr>
+        <w:t xml:space="preserve">Built Shopline e-commerce frontend for spirits brand: homepage, 6 brand pages, 5 category pages, 56 product listings, About and Customer Service pages — all with custom HTML/CSS architecture.</w:t>
+      </w:r>
+    </w:p>
+    <w:p>
+      <w:pPr>
+        <w:pStyle w:val="ListParagraph"/>
+        <w:numPr>
+          <w:ilvl w:val="0"/>
+          <w:numId w:val="2"/>
+        </w:numPr>
+        <w:spacing w:after="60" w:before="0"/>
+      </w:pPr>
+      <w:r>
+        <w:rPr>
+          <w:rFonts w:ascii="Arial" w:cs="Arial" w:eastAsia="Arial" w:hAnsi="Arial"/>
+          <w:b/>
+          <w:bCs/>
+          <w:i w:val="false"/>
+          <w:iCs w:val="false"/>
+          <w:color w:val="1d1d1f"/>
+          <w:sz w:val="20"/>
+          <w:szCs w:val="20"/>
+        </w:rPr>
+        <w:t xml:space="preserve">[SEO Results]  </w:t>
+      </w:r>
+      <w:r>
+        <w:rPr>
+          <w:rFonts w:ascii="Arial" w:cs="Arial" w:eastAsia="Arial" w:hAnsi="Arial"/>
+          <w:b w:val="false"/>
+          <w:bCs w:val="false"/>
+          <w:i w:val="false"/>
+          <w:iCs w:val="false"/>
+          <w:color w:val="595959"/>
+          <w:sz w:val="20"/>
+          <w:szCs w:val="20"/>
+        </w:rPr>
+        <w:t xml:space="preserve">Precision SEO across all pages &amp; product images; 28-day GSC: 90 clicks (↑14%), 558 impressions (↑10%), </w:t>
+      </w:r>
+      <w:r>
+        <w:rPr>
+          <w:rFonts w:ascii="Arial" w:cs="Arial" w:eastAsia="Arial" w:hAnsi="Arial"/>
+          <w:b/>
+          <w:bCs/>
+          <w:i w:val="false"/>
+          <w:iCs w:val="false"/>
+          <w:color w:val="1d1d1f"/>
+          <w:sz w:val="20"/>
+          <w:szCs w:val="20"/>
+        </w:rPr>
+        <w:t xml:space="preserve">CTR 16.1% — 3–8× industry average</w:t>
+      </w:r>
+      <w:r>
+        <w:rPr>
+          <w:rFonts w:ascii="Arial" w:cs="Arial" w:eastAsia="Arial" w:hAnsi="Arial"/>
+          <w:b w:val="false"/>
+          <w:bCs w:val="false"/>
+          <w:i w:val="false"/>
+          <w:iCs w:val="false"/>
+          <w:color w:val="595959"/>
+          <w:sz w:val="20"/>
+          <w:szCs w:val="20"/>
+        </w:rPr>
+        <w:t xml:space="preserve">; 7-day clicks: 50 (↑72%).</w:t>
+      </w:r>
+    </w:p>
+    <w:p>
+      <w:pPr>
+        <w:pStyle w:val="ListParagraph"/>
+        <w:numPr>
+          <w:ilvl w:val="0"/>
+          <w:numId w:val="2"/>
+        </w:numPr>
+        <w:spacing w:after="60" w:before="0"/>
+      </w:pPr>
+      <w:r>
+        <w:rPr>
+          <w:rFonts w:ascii="Arial" w:cs="Arial" w:eastAsia="Arial" w:hAnsi="Arial"/>
+          <w:b/>
+          <w:bCs/>
+          <w:i w:val="false"/>
+          <w:iCs w:val="false"/>
+          <w:color w:val="1d1d1f"/>
+          <w:sz w:val="20"/>
+          <w:szCs w:val="20"/>
+        </w:rPr>
+        <w:t xml:space="preserve">[UI/UX Design]  </w:t>
+      </w:r>
+      <w:r>
+        <w:rPr>
+          <w:rFonts w:ascii="Arial" w:cs="Arial" w:eastAsia="Arial" w:hAnsi="Arial"/>
+          <w:b w:val="false"/>
+          <w:bCs w:val="false"/>
+          <w:i w:val="false"/>
+          <w:iCs w:val="false"/>
+          <w:color w:val="595959"/>
+          <w:sz w:val="20"/>
+          <w:szCs w:val="20"/>
+        </w:rPr>
+        <w:t xml:space="preserve">Solo-completed UI/UX design for a Korean floral brand: from competitive analysis and market positioning through Figma high-fidelity prototyping.</w:t>
+      </w:r>
+    </w:p>
+    <w:p>
+      <w:pPr>
+        <w:pStyle w:val="ListParagraph"/>
+        <w:numPr>
+          <w:ilvl w:val="0"/>
+          <w:numId w:val="2"/>
+        </w:numPr>
+        <w:spacing w:after="60" w:before="0"/>
+      </w:pPr>
+      <w:r>
+        <w:rPr>
+          <w:rFonts w:ascii="Arial" w:cs="Arial" w:eastAsia="Arial" w:hAnsi="Arial"/>
+          <w:b/>
+          <w:bCs/>
+          <w:i w:val="false"/>
+          <w:iCs w:val="false"/>
+          <w:color w:val="1d1d1f"/>
+          <w:sz w:val="20"/>
+          <w:szCs w:val="20"/>
+        </w:rPr>
+        <w:t xml:space="preserve">[Certifications]  </w:t>
+      </w:r>
+      <w:r>
+        <w:rPr>
+          <w:rFonts w:ascii="Arial" w:cs="Arial" w:eastAsia="Arial" w:hAnsi="Arial"/>
+          <w:b w:val="false"/>
+          <w:bCs w:val="false"/>
+          <w:i w:val="false"/>
+          <w:iCs w:val="false"/>
+          <w:color w:val="595959"/>
+          <w:sz w:val="20"/>
+          <w:szCs w:val="20"/>
+        </w:rPr>
+        <w:t xml:space="preserve">Adobe Photoshop &amp; Illustrator professional dual certification; Google UX Design Specialization (Coursera, 7 courses — Figma high-fidelity prototype, UX research, wireframing).</w:t>
       </w:r>
     </w:p>
     <w:p>

</xml_diff>

<commit_message>
update: 更新 index.html + 新增履歷檔案
</commit_message>
<xml_diff>
--- a/Reyna_Gao_Resume_EN.docx
+++ b/Reyna_Gao_Resume_EN.docx
@@ -621,7 +621,7 @@
           <w:sz w:val="22"/>
           <w:szCs w:val="22"/>
         </w:rPr>
-        <w:t xml:space="preserve">AI Job Competency System  |  SA / SD Architecture Design</w:t>
+        <w:t xml:space="preserve">Taiwan Engineer Job Market Competitiveness Analysis System  |  SA / SD × ETL × BI</w:t>
       </w:r>
       <w:r>
         <w:rPr>
@@ -670,30 +670,128 @@
           <w:sz w:val="20"/>
           <w:szCs w:val="20"/>
         </w:rPr>
-        <w:t xml:space="preserve">Led system analysis (SA) and system design (SD) planning, defining MySQL table structures and ERDs for various industry contexts.</w:t>
-      </w:r>
-    </w:p>
-    <w:p>
-      <w:pPr>
-        <w:pStyle w:val="ListParagraph"/>
-        <w:numPr>
-          <w:ilvl w:val="0"/>
-          <w:numId w:val="2"/>
-        </w:numPr>
-        <w:spacing w:after="60" w:before="0"/>
-      </w:pPr>
-      <w:r>
-        <w:rPr>
-          <w:rFonts w:ascii="Arial" w:cs="Arial" w:eastAsia="Arial" w:hAnsi="Arial"/>
-          <w:b w:val="false"/>
-          <w:bCs w:val="false"/>
-          <w:i w:val="false"/>
-          <w:iCs w:val="false"/>
-          <w:color w:val="595959"/>
-          <w:sz w:val="20"/>
-          <w:szCs w:val="20"/>
-        </w:rPr>
-        <w:t xml:space="preserve">Designed a highly extensible schema that significantly reduces future refactoring costs and supports ongoing feature iteration and AI competency data flow.</w:t>
+        <w:t xml:space="preserve">Led SA/SD planning: designed 3 MySQL tables (jobs / skills / job_skills_mapping) and ERD, defined 12-column scraping specs, published DevOps SOP for all team members.</w:t>
+      </w:r>
+    </w:p>
+    <w:p>
+      <w:pPr>
+        <w:pStyle w:val="ListParagraph"/>
+        <w:numPr>
+          <w:ilvl w:val="0"/>
+          <w:numId w:val="2"/>
+        </w:numPr>
+        <w:spacing w:after="60" w:before="0"/>
+      </w:pPr>
+      <w:r>
+        <w:rPr>
+          <w:rFonts w:ascii="Arial" w:cs="Arial" w:eastAsia="Arial" w:hAnsi="Arial"/>
+          <w:b w:val="false"/>
+          <w:bCs w:val="false"/>
+          <w:i w:val="false"/>
+          <w:iCs w:val="false"/>
+          <w:color w:val="595959"/>
+          <w:sz w:val="20"/>
+          <w:szCs w:val="20"/>
+        </w:rPr>
+        <w:t xml:space="preserve">Led ETL data cleaning (CSV merge &amp; dedup → MySQL import), integrating 6 platforms (104, 1111, Yes123, CakeResume, etc.) with </w:t>
+      </w:r>
+      <w:r>
+        <w:rPr>
+          <w:rFonts w:ascii="Arial" w:cs="Arial" w:eastAsia="Arial" w:hAnsi="Arial"/>
+          <w:b/>
+          <w:bCs/>
+          <w:i w:val="false"/>
+          <w:iCs w:val="false"/>
+          <w:color w:val="1d1d1f"/>
+          <w:sz w:val="20"/>
+          <w:szCs w:val="20"/>
+        </w:rPr>
+        <w:t xml:space="preserve">12,297 engineer job listings</w:t>
+      </w:r>
+      <w:r>
+        <w:rPr>
+          <w:rFonts w:ascii="Arial" w:cs="Arial" w:eastAsia="Arial" w:hAnsi="Arial"/>
+          <w:b w:val="false"/>
+          <w:bCs w:val="false"/>
+          <w:i w:val="false"/>
+          <w:iCs w:val="false"/>
+          <w:color w:val="595959"/>
+          <w:sz w:val="20"/>
+          <w:szCs w:val="20"/>
+        </w:rPr>
+        <w:t xml:space="preserve">; simultaneously set up GCP cloud backup database.</w:t>
+      </w:r>
+    </w:p>
+    <w:p>
+      <w:pPr>
+        <w:pStyle w:val="ListParagraph"/>
+        <w:numPr>
+          <w:ilvl w:val="0"/>
+          <w:numId w:val="2"/>
+        </w:numPr>
+        <w:spacing w:after="60" w:before="0"/>
+      </w:pPr>
+      <w:r>
+        <w:rPr>
+          <w:rFonts w:ascii="Arial" w:cs="Arial" w:eastAsia="Arial" w:hAnsi="Arial"/>
+          <w:b w:val="false"/>
+          <w:bCs w:val="false"/>
+          <w:i w:val="false"/>
+          <w:iCs w:val="false"/>
+          <w:color w:val="595959"/>
+          <w:sz w:val="20"/>
+          <w:szCs w:val="20"/>
+        </w:rPr>
+        <w:t xml:space="preserve">Led Tableau narrative architecture planning, built Dashboard framework with direct MySQL connection, producing 7 Story Points visualization pages (salary distribution, skill quadrants, market trends, etc.).</w:t>
+      </w:r>
+    </w:p>
+    <w:p>
+      <w:pPr>
+        <w:pStyle w:val="ListParagraph"/>
+        <w:numPr>
+          <w:ilvl w:val="0"/>
+          <w:numId w:val="2"/>
+        </w:numPr>
+        <w:spacing w:after="60" w:before="0"/>
+      </w:pPr>
+      <w:r>
+        <w:rPr>
+          <w:rFonts w:ascii="Arial" w:cs="Arial" w:eastAsia="Arial" w:hAnsi="Arial"/>
+          <w:b w:val="false"/>
+          <w:bCs w:val="false"/>
+          <w:i w:val="false"/>
+          <w:iCs w:val="false"/>
+          <w:color w:val="595959"/>
+          <w:sz w:val="20"/>
+          <w:szCs w:val="20"/>
+        </w:rPr>
+        <w:t xml:space="preserve">Supported frontend UI development; </w:t>
+      </w:r>
+      <w:r>
+        <w:rPr>
+          <w:rFonts w:ascii="Arial" w:cs="Arial" w:eastAsia="Arial" w:hAnsi="Arial"/>
+          <w:b/>
+          <w:bCs/>
+          <w:i w:val="false"/>
+          <w:iCs w:val="false"/>
+          <w:color w:val="1d1d1f"/>
+          <w:sz w:val="20"/>
+          <w:szCs w:val="20"/>
+        </w:rPr>
+        <w:t xml:space="preserve">delivering a real-time engineer job market intelligence platform for job seekers and employers</w:t>
+      </w:r>
+      <w:r>
+        <w:rPr>
+          <w:rFonts w:ascii="Arial" w:cs="Arial" w:eastAsia="Arial" w:hAnsi="Arial"/>
+          <w:b w:val="false"/>
+          <w:bCs w:val="false"/>
+          <w:i w:val="false"/>
+          <w:iCs w:val="false"/>
+          <w:color w:val="595959"/>
+          <w:sz w:val="20"/>
+          <w:szCs w:val="20"/>
+        </w:rPr>
+        <w:t xml:space="preserve">.</w:t>
       </w:r>
     </w:p>
     <w:p>

</xml_diff>